<commit_message>
Made corrections. Now if there is an annual adjustment, then the line in the table is split into 2.
</commit_message>
<xml_diff>
--- a/experiments/app-v1/templates/calculation_claim.docx
+++ b/experiments/app-v1/templates/calculation_claim.docx
@@ -132,8 +132,8 @@
         <w:gridCol w:w="194"/>
         <w:gridCol w:w="1578"/>
         <w:gridCol w:w="2050"/>
-        <w:gridCol w:w="1405"/>
-        <w:gridCol w:w="1794"/>
+        <w:gridCol w:w="1407"/>
+        <w:gridCol w:w="1792"/>
       </w:tblGrid>
       <w:tr>
         <w:trPr>
@@ -522,7 +522,7 @@
         </w:tc>
         <w:tc>
           <w:tcPr>
-            <w:tcW w:w="3455" w:type="dxa"/>
+            <w:tcW w:w="3457" w:type="dxa"/>
             <w:gridSpan w:val="2"/>
             <w:vMerge w:val="restart"/>
             <w:tcBorders>
@@ -557,7 +557,7 @@
         </w:tc>
         <w:tc>
           <w:tcPr>
-            <w:tcW w:w="1794" w:type="dxa"/>
+            <w:tcW w:w="1792" w:type="dxa"/>
             <w:vMerge w:val="restart"/>
             <w:tcBorders>
               <w:top w:val="single" w:sz="6" w:space="0" w:color="CCCCCC"/>
@@ -813,7 +813,7 @@
         </w:tc>
         <w:tc>
           <w:tcPr>
-            <w:tcW w:w="3455" w:type="dxa"/>
+            <w:tcW w:w="3457" w:type="dxa"/>
             <w:gridSpan w:val="2"/>
             <w:vMerge w:val="continue"/>
             <w:tcBorders>
@@ -843,7 +843,7 @@
         </w:tc>
         <w:tc>
           <w:tcPr>
-            <w:tcW w:w="1794" w:type="dxa"/>
+            <w:tcW w:w="1792" w:type="dxa"/>
             <w:vMerge w:val="continue"/>
             <w:tcBorders>
               <w:top w:val="single" w:sz="6" w:space="0" w:color="CCCCCC"/>
@@ -1309,7 +1309,7 @@
         </w:tc>
         <w:tc>
           <w:tcPr>
-            <w:tcW w:w="3455" w:type="dxa"/>
+            <w:tcW w:w="3457" w:type="dxa"/>
             <w:gridSpan w:val="2"/>
             <w:tcBorders>
               <w:top w:val="single" w:sz="6" w:space="0" w:color="CCCCCC"/>
@@ -1339,7 +1339,7 @@
         </w:tc>
         <w:tc>
           <w:tcPr>
-            <w:tcW w:w="1794" w:type="dxa"/>
+            <w:tcW w:w="1792" w:type="dxa"/>
             <w:tcBorders>
               <w:top w:val="single" w:sz="6" w:space="0" w:color="CCCCCC"/>
               <w:left w:val="single" w:sz="6" w:space="0" w:color="CCCCCC"/>
@@ -1758,7 +1758,7 @@
         </w:tc>
         <w:tc>
           <w:tcPr>
-            <w:tcW w:w="3455" w:type="dxa"/>
+            <w:tcW w:w="3457" w:type="dxa"/>
             <w:gridSpan w:val="2"/>
             <w:tcBorders>
               <w:top w:val="single" w:sz="6" w:space="0" w:color="CCCCCC"/>
@@ -1792,7 +1792,7 @@
         </w:tc>
         <w:tc>
           <w:tcPr>
-            <w:tcW w:w="1794" w:type="dxa"/>
+            <w:tcW w:w="1792" w:type="dxa"/>
             <w:tcBorders>
               <w:top w:val="single" w:sz="6" w:space="0" w:color="CCCCCC"/>
               <w:left w:val="single" w:sz="6" w:space="0" w:color="CCCCCC"/>
@@ -2430,13 +2430,17 @@
             <w:pPr>
               <w:pStyle w:val="Normal"/>
               <w:spacing w:lineRule="auto" w:line="240" w:before="0" w:after="0"/>
-              <w:rPr/>
-            </w:pPr>
-            <w:r>
-              <w:rPr>
-                <w:rFonts w:ascii="Times New Roman" w:hAnsi="Times New Roman"/>
-                <w:b/>
-                <w:bCs/>
+              <w:jc w:val="center"/>
+              <w:rPr>
+                <w:b w:val="false"/>
+                <w:bCs w:val="false"/>
+              </w:rPr>
+            </w:pPr>
+            <w:r>
+              <w:rPr>
+                <w:rFonts w:ascii="Times New Roman" w:hAnsi="Times New Roman"/>
+                <w:b w:val="false"/>
+                <w:bCs w:val="false"/>
                 <w:sz w:val="18"/>
                 <w:szCs w:val="18"/>
                 <w:shd w:fill="auto" w:val="clear"/>
@@ -2462,13 +2466,17 @@
             <w:pPr>
               <w:pStyle w:val="Normal"/>
               <w:spacing w:lineRule="auto" w:line="240" w:before="0" w:after="0"/>
-              <w:rPr/>
-            </w:pPr>
-            <w:r>
-              <w:rPr>
-                <w:rFonts w:ascii="Times New Roman" w:hAnsi="Times New Roman"/>
-                <w:b/>
-                <w:bCs/>
+              <w:jc w:val="center"/>
+              <w:rPr>
+                <w:b w:val="false"/>
+                <w:bCs w:val="false"/>
+              </w:rPr>
+            </w:pPr>
+            <w:r>
+              <w:rPr>
+                <w:rFonts w:ascii="Times New Roman" w:hAnsi="Times New Roman"/>
+                <w:b w:val="false"/>
+                <w:bCs w:val="false"/>
                 <w:sz w:val="18"/>
                 <w:szCs w:val="18"/>
                 <w:shd w:fill="auto" w:val="clear"/>
@@ -2479,8 +2487,8 @@
             <w:r>
               <w:rPr>
                 <w:rFonts w:ascii="Times New Roman" w:hAnsi="Times New Roman"/>
-                <w:b/>
-                <w:bCs/>
+                <w:b w:val="false"/>
+                <w:bCs w:val="false"/>
                 <w:sz w:val="18"/>
                 <w:szCs w:val="18"/>
                 <w:shd w:fill="auto" w:val="clear"/>
@@ -2506,13 +2514,17 @@
             <w:pPr>
               <w:pStyle w:val="Normal"/>
               <w:spacing w:lineRule="auto" w:line="240" w:before="0" w:after="0"/>
-              <w:rPr/>
-            </w:pPr>
-            <w:r>
-              <w:rPr>
-                <w:rFonts w:ascii="Times New Roman" w:hAnsi="Times New Roman"/>
-                <w:b/>
-                <w:bCs/>
+              <w:jc w:val="center"/>
+              <w:rPr>
+                <w:b w:val="false"/>
+                <w:bCs w:val="false"/>
+              </w:rPr>
+            </w:pPr>
+            <w:r>
+              <w:rPr>
+                <w:rFonts w:ascii="Times New Roman" w:hAnsi="Times New Roman"/>
+                <w:b w:val="false"/>
+                <w:bCs w:val="false"/>
                 <w:sz w:val="18"/>
                 <w:szCs w:val="18"/>
                 <w:shd w:fill="auto" w:val="clear"/>
@@ -2523,8 +2535,8 @@
             <w:r>
               <w:rPr>
                 <w:rFonts w:ascii="Times New Roman" w:hAnsi="Times New Roman"/>
-                <w:b/>
-                <w:bCs/>
+                <w:b w:val="false"/>
+                <w:bCs w:val="false"/>
                 <w:sz w:val="18"/>
                 <w:szCs w:val="18"/>
                 <w:shd w:fill="auto" w:val="clear"/>
@@ -2550,13 +2562,17 @@
             <w:pPr>
               <w:pStyle w:val="Normal"/>
               <w:spacing w:lineRule="auto" w:line="240" w:before="0" w:after="0"/>
-              <w:rPr/>
-            </w:pPr>
-            <w:r>
-              <w:rPr>
-                <w:rFonts w:ascii="Times New Roman" w:hAnsi="Times New Roman"/>
-                <w:b/>
-                <w:bCs/>
+              <w:jc w:val="center"/>
+              <w:rPr>
+                <w:b w:val="false"/>
+                <w:bCs w:val="false"/>
+              </w:rPr>
+            </w:pPr>
+            <w:r>
+              <w:rPr>
+                <w:rFonts w:ascii="Times New Roman" w:hAnsi="Times New Roman"/>
+                <w:b w:val="false"/>
+                <w:bCs w:val="false"/>
                 <w:sz w:val="18"/>
                 <w:szCs w:val="18"/>
                 <w:shd w:fill="auto" w:val="clear"/>
@@ -2567,8 +2583,8 @@
             <w:r>
               <w:rPr>
                 <w:rFonts w:ascii="Times New Roman" w:hAnsi="Times New Roman"/>
-                <w:b/>
-                <w:bCs/>
+                <w:b w:val="false"/>
+                <w:bCs w:val="false"/>
                 <w:sz w:val="18"/>
                 <w:szCs w:val="18"/>
                 <w:shd w:fill="auto" w:val="clear"/>
@@ -2818,29 +2834,7 @@
           <w:szCs w:val="24"/>
           <w:lang w:val="ru-RU"/>
         </w:rPr>
-        <w:t xml:space="preserve">Общая цена иска: </w:t>
-      </w:r>
-      <w:r>
-        <w:rPr>
-          <w:rFonts w:ascii="Times New Roman" w:hAnsi="Times New Roman"/>
-          <w:b/>
-          <w:bCs/>
-          <w:sz w:val="24"/>
-          <w:szCs w:val="24"/>
-          <w:lang w:val="ru-RU"/>
-        </w:rPr>
-        <w:t>/*цена иска*/</w:t>
-      </w:r>
-      <w:r>
-        <w:rPr>
-          <w:rFonts w:ascii="Times New Roman" w:hAnsi="Times New Roman"/>
-          <w:b/>
-          <w:bCs/>
-          <w:sz w:val="24"/>
-          <w:szCs w:val="24"/>
-          <w:lang w:val="ru-RU"/>
-        </w:rPr>
-        <w:t xml:space="preserve"> </w:t>
+        <w:t xml:space="preserve">Общая цена иска: /*цена иска*/ </w:t>
       </w:r>
       <w:bookmarkStart w:id="0" w:name="_Hlk99377779"/>
       <w:r>
@@ -2913,18 +2907,7 @@
           <w:szCs w:val="24"/>
           <w:lang w:val="ru-RU"/>
         </w:rPr>
-        <w:t xml:space="preserve">/*госпошлина*/ </w:t>
-      </w:r>
-      <w:r>
-        <w:rPr>
-          <w:rFonts w:ascii="Times New Roman" w:hAnsi="Times New Roman"/>
-          <w:b/>
-          <w:bCs/>
-          <w:sz w:val="24"/>
-          <w:szCs w:val="24"/>
-          <w:lang w:val="ru-RU"/>
-        </w:rPr>
-        <w:t>рублей.</w:t>
+        <w:t>/*госпошлина*/ рублей.</w:t>
       </w:r>
     </w:p>
     <w:p>

</xml_diff>

<commit_message>
Sole the problem with second and third tables in claim
</commit_message>
<xml_diff>
--- a/experiments/app-v1/templates/calculation_claim.docx
+++ b/experiments/app-v1/templates/calculation_claim.docx
@@ -105,7 +105,7 @@
           <w:szCs w:val="24"/>
           <w:lang w:val="ru-RU"/>
         </w:rPr>
-        <w:t>Исходя из размера Основного долга и Периода задолженности, неустойка по состоянию на 25.04.2025 составляет:</w:t>
+        <w:t>Исходя из размера Основного долга и Периода задолженности, неустойка по состоянию на /*текущая дата*/ составляет:</w:t>
       </w:r>
     </w:p>
     <w:tbl>
@@ -132,8 +132,8 @@
         <w:gridCol w:w="194"/>
         <w:gridCol w:w="1578"/>
         <w:gridCol w:w="2050"/>
-        <w:gridCol w:w="1407"/>
-        <w:gridCol w:w="1792"/>
+        <w:gridCol w:w="1415"/>
+        <w:gridCol w:w="1784"/>
       </w:tblGrid>
       <w:tr>
         <w:trPr>
@@ -197,7 +197,7 @@
                 <w:shd w:fill="auto" w:val="clear"/>
                 <w:lang w:val="ru-RU"/>
               </w:rPr>
-              <w:t xml:space="preserve">Договор № </w:t>
+              <w:t xml:space="preserve">Договор </w:t>
             </w:r>
             <w:r>
               <w:rPr>
@@ -522,7 +522,7 @@
         </w:tc>
         <w:tc>
           <w:tcPr>
-            <w:tcW w:w="3457" w:type="dxa"/>
+            <w:tcW w:w="3465" w:type="dxa"/>
             <w:gridSpan w:val="2"/>
             <w:vMerge w:val="restart"/>
             <w:tcBorders>
@@ -557,7 +557,7 @@
         </w:tc>
         <w:tc>
           <w:tcPr>
-            <w:tcW w:w="1792" w:type="dxa"/>
+            <w:tcW w:w="1784" w:type="dxa"/>
             <w:vMerge w:val="restart"/>
             <w:tcBorders>
               <w:top w:val="single" w:sz="6" w:space="0" w:color="CCCCCC"/>
@@ -813,7 +813,7 @@
         </w:tc>
         <w:tc>
           <w:tcPr>
-            <w:tcW w:w="3457" w:type="dxa"/>
+            <w:tcW w:w="3465" w:type="dxa"/>
             <w:gridSpan w:val="2"/>
             <w:vMerge w:val="continue"/>
             <w:tcBorders>
@@ -843,7 +843,7 @@
         </w:tc>
         <w:tc>
           <w:tcPr>
-            <w:tcW w:w="1792" w:type="dxa"/>
+            <w:tcW w:w="1784" w:type="dxa"/>
             <w:vMerge w:val="continue"/>
             <w:tcBorders>
               <w:top w:val="single" w:sz="6" w:space="0" w:color="CCCCCC"/>
@@ -1309,7 +1309,7 @@
         </w:tc>
         <w:tc>
           <w:tcPr>
-            <w:tcW w:w="3457" w:type="dxa"/>
+            <w:tcW w:w="3465" w:type="dxa"/>
             <w:gridSpan w:val="2"/>
             <w:tcBorders>
               <w:top w:val="single" w:sz="6" w:space="0" w:color="CCCCCC"/>
@@ -1339,7 +1339,7 @@
         </w:tc>
         <w:tc>
           <w:tcPr>
-            <w:tcW w:w="1792" w:type="dxa"/>
+            <w:tcW w:w="1784" w:type="dxa"/>
             <w:tcBorders>
               <w:top w:val="single" w:sz="6" w:space="0" w:color="CCCCCC"/>
               <w:left w:val="single" w:sz="6" w:space="0" w:color="CCCCCC"/>
@@ -1758,7 +1758,7 @@
         </w:tc>
         <w:tc>
           <w:tcPr>
-            <w:tcW w:w="3457" w:type="dxa"/>
+            <w:tcW w:w="3465" w:type="dxa"/>
             <w:gridSpan w:val="2"/>
             <w:tcBorders>
               <w:top w:val="single" w:sz="6" w:space="0" w:color="CCCCCC"/>
@@ -1792,7 +1792,7 @@
         </w:tc>
         <w:tc>
           <w:tcPr>
-            <w:tcW w:w="1792" w:type="dxa"/>
+            <w:tcW w:w="1784" w:type="dxa"/>
             <w:tcBorders>
               <w:top w:val="single" w:sz="6" w:space="0" w:color="CCCCCC"/>
               <w:left w:val="single" w:sz="6" w:space="0" w:color="CCCCCC"/>
@@ -2400,13 +2400,18 @@
               <w:pStyle w:val="Normal"/>
               <w:spacing w:lineRule="auto" w:line="240" w:before="0" w:after="0"/>
               <w:jc w:val="center"/>
-              <w:rPr/>
+              <w:rPr>
+                <w:sz w:val="22"/>
+                <w:szCs w:val="22"/>
+              </w:rPr>
             </w:pPr>
             <w:r>
               <w:rPr>
                 <w:rFonts w:ascii="Times New Roman" w:hAnsi="Times New Roman"/>
                 <w:b/>
                 <w:bCs/>
+                <w:sz w:val="22"/>
+                <w:szCs w:val="22"/>
                 <w:shd w:fill="auto" w:val="clear"/>
                 <w:lang w:val="ru-RU"/>
               </w:rPr>
@@ -2432,17 +2437,17 @@
               <w:spacing w:lineRule="auto" w:line="240" w:before="0" w:after="0"/>
               <w:jc w:val="center"/>
               <w:rPr>
+                <w:sz w:val="22"/>
+                <w:szCs w:val="22"/>
+              </w:rPr>
+            </w:pPr>
+            <w:r>
+              <w:rPr>
+                <w:rFonts w:ascii="Times New Roman" w:hAnsi="Times New Roman"/>
                 <w:b w:val="false"/>
                 <w:bCs w:val="false"/>
-              </w:rPr>
-            </w:pPr>
-            <w:r>
-              <w:rPr>
-                <w:rFonts w:ascii="Times New Roman" w:hAnsi="Times New Roman"/>
-                <w:b w:val="false"/>
-                <w:bCs w:val="false"/>
-                <w:sz w:val="18"/>
-                <w:szCs w:val="18"/>
+                <w:sz w:val="22"/>
+                <w:szCs w:val="22"/>
                 <w:shd w:fill="auto" w:val="clear"/>
                 <w:lang w:val="ru-RU"/>
               </w:rPr>
@@ -2468,29 +2473,29 @@
               <w:spacing w:lineRule="auto" w:line="240" w:before="0" w:after="0"/>
               <w:jc w:val="center"/>
               <w:rPr>
+                <w:sz w:val="22"/>
+                <w:szCs w:val="22"/>
+              </w:rPr>
+            </w:pPr>
+            <w:r>
+              <w:rPr>
+                <w:rFonts w:ascii="Times New Roman" w:hAnsi="Times New Roman"/>
                 <w:b w:val="false"/>
                 <w:bCs w:val="false"/>
-              </w:rPr>
-            </w:pPr>
+                <w:sz w:val="22"/>
+                <w:szCs w:val="22"/>
+                <w:shd w:fill="auto" w:val="clear"/>
+                <w:lang w:val="ru-RU"/>
+              </w:rPr>
+              <w:t xml:space="preserve"> </w:t>
+            </w:r>
             <w:r>
               <w:rPr>
                 <w:rFonts w:ascii="Times New Roman" w:hAnsi="Times New Roman"/>
                 <w:b w:val="false"/>
                 <w:bCs w:val="false"/>
-                <w:sz w:val="18"/>
-                <w:szCs w:val="18"/>
-                <w:shd w:fill="auto" w:val="clear"/>
-                <w:lang w:val="ru-RU"/>
-              </w:rPr>
-              <w:t xml:space="preserve"> </w:t>
-            </w:r>
-            <w:r>
-              <w:rPr>
-                <w:rFonts w:ascii="Times New Roman" w:hAnsi="Times New Roman"/>
-                <w:b w:val="false"/>
-                <w:bCs w:val="false"/>
-                <w:sz w:val="18"/>
-                <w:szCs w:val="18"/>
+                <w:sz w:val="22"/>
+                <w:szCs w:val="22"/>
                 <w:shd w:fill="auto" w:val="clear"/>
                 <w:lang w:val="ru-RU"/>
               </w:rPr>
@@ -2516,29 +2521,29 @@
               <w:spacing w:lineRule="auto" w:line="240" w:before="0" w:after="0"/>
               <w:jc w:val="center"/>
               <w:rPr>
+                <w:sz w:val="22"/>
+                <w:szCs w:val="22"/>
+              </w:rPr>
+            </w:pPr>
+            <w:r>
+              <w:rPr>
+                <w:rFonts w:ascii="Times New Roman" w:hAnsi="Times New Roman"/>
                 <w:b w:val="false"/>
                 <w:bCs w:val="false"/>
-              </w:rPr>
-            </w:pPr>
+                <w:sz w:val="22"/>
+                <w:szCs w:val="22"/>
+                <w:shd w:fill="auto" w:val="clear"/>
+                <w:lang w:val="ru-RU"/>
+              </w:rPr>
+              <w:t xml:space="preserve"> </w:t>
+            </w:r>
             <w:r>
               <w:rPr>
                 <w:rFonts w:ascii="Times New Roman" w:hAnsi="Times New Roman"/>
                 <w:b w:val="false"/>
                 <w:bCs w:val="false"/>
-                <w:sz w:val="18"/>
-                <w:szCs w:val="18"/>
-                <w:shd w:fill="auto" w:val="clear"/>
-                <w:lang w:val="ru-RU"/>
-              </w:rPr>
-              <w:t xml:space="preserve"> </w:t>
-            </w:r>
-            <w:r>
-              <w:rPr>
-                <w:rFonts w:ascii="Times New Roman" w:hAnsi="Times New Roman"/>
-                <w:b w:val="false"/>
-                <w:bCs w:val="false"/>
-                <w:sz w:val="18"/>
-                <w:szCs w:val="18"/>
+                <w:sz w:val="22"/>
+                <w:szCs w:val="22"/>
                 <w:shd w:fill="auto" w:val="clear"/>
                 <w:lang w:val="ru-RU"/>
               </w:rPr>
@@ -2564,29 +2569,29 @@
               <w:spacing w:lineRule="auto" w:line="240" w:before="0" w:after="0"/>
               <w:jc w:val="center"/>
               <w:rPr>
+                <w:sz w:val="22"/>
+                <w:szCs w:val="22"/>
+              </w:rPr>
+            </w:pPr>
+            <w:r>
+              <w:rPr>
+                <w:rFonts w:ascii="Times New Roman" w:hAnsi="Times New Roman"/>
                 <w:b w:val="false"/>
                 <w:bCs w:val="false"/>
-              </w:rPr>
-            </w:pPr>
+                <w:sz w:val="22"/>
+                <w:szCs w:val="22"/>
+                <w:shd w:fill="auto" w:val="clear"/>
+                <w:lang w:val="ru-RU"/>
+              </w:rPr>
+              <w:t xml:space="preserve"> </w:t>
+            </w:r>
             <w:r>
               <w:rPr>
                 <w:rFonts w:ascii="Times New Roman" w:hAnsi="Times New Roman"/>
                 <w:b w:val="false"/>
                 <w:bCs w:val="false"/>
-                <w:sz w:val="18"/>
-                <w:szCs w:val="18"/>
-                <w:shd w:fill="auto" w:val="clear"/>
-                <w:lang w:val="ru-RU"/>
-              </w:rPr>
-              <w:t xml:space="preserve"> </w:t>
-            </w:r>
-            <w:r>
-              <w:rPr>
-                <w:rFonts w:ascii="Times New Roman" w:hAnsi="Times New Roman"/>
-                <w:b w:val="false"/>
-                <w:bCs w:val="false"/>
-                <w:sz w:val="18"/>
-                <w:szCs w:val="18"/>
+                <w:sz w:val="22"/>
+                <w:szCs w:val="22"/>
                 <w:shd w:fill="auto" w:val="clear"/>
                 <w:lang w:val="ru-RU"/>
               </w:rPr>
@@ -2617,13 +2622,18 @@
               <w:pStyle w:val="Normal"/>
               <w:spacing w:lineRule="auto" w:line="240" w:before="0" w:after="0"/>
               <w:jc w:val="right"/>
-              <w:rPr/>
+              <w:rPr>
+                <w:sz w:val="22"/>
+                <w:szCs w:val="22"/>
+              </w:rPr>
             </w:pPr>
             <w:r>
               <w:rPr>
                 <w:rFonts w:ascii="Times New Roman" w:hAnsi="Times New Roman"/>
                 <w:b/>
                 <w:bCs/>
+                <w:sz w:val="22"/>
+                <w:szCs w:val="22"/>
                 <w:shd w:fill="auto" w:val="clear"/>
                 <w:lang w:val="ru-RU"/>
               </w:rPr>
@@ -2647,15 +2657,18 @@
             <w:pPr>
               <w:pStyle w:val="Normal"/>
               <w:spacing w:lineRule="auto" w:line="240" w:before="0" w:after="0"/>
-              <w:rPr/>
+              <w:rPr>
+                <w:sz w:val="22"/>
+                <w:szCs w:val="22"/>
+              </w:rPr>
             </w:pPr>
             <w:r>
               <w:rPr>
                 <w:rFonts w:ascii="Times New Roman" w:hAnsi="Times New Roman"/>
                 <w:b/>
                 <w:bCs/>
-                <w:sz w:val="18"/>
-                <w:szCs w:val="18"/>
+                <w:sz w:val="22"/>
+                <w:szCs w:val="22"/>
                 <w:shd w:fill="auto" w:val="clear"/>
                 <w:lang w:val="ru-RU"/>
               </w:rPr>
@@ -2666,8 +2679,8 @@
                 <w:rFonts w:ascii="Times New Roman" w:hAnsi="Times New Roman"/>
                 <w:b/>
                 <w:bCs/>
-                <w:sz w:val="18"/>
-                <w:szCs w:val="18"/>
+                <w:sz w:val="22"/>
+                <w:szCs w:val="22"/>
                 <w:shd w:fill="auto" w:val="clear"/>
                 <w:lang w:val="ru-RU"/>
               </w:rPr>
@@ -2691,15 +2704,18 @@
             <w:pPr>
               <w:pStyle w:val="Normal"/>
               <w:spacing w:lineRule="auto" w:line="240" w:before="0" w:after="0"/>
-              <w:rPr/>
+              <w:rPr>
+                <w:sz w:val="22"/>
+                <w:szCs w:val="22"/>
+              </w:rPr>
             </w:pPr>
             <w:r>
               <w:rPr>
                 <w:rFonts w:ascii="Times New Roman" w:hAnsi="Times New Roman"/>
                 <w:b/>
                 <w:bCs/>
-                <w:sz w:val="18"/>
-                <w:szCs w:val="18"/>
+                <w:sz w:val="22"/>
+                <w:szCs w:val="22"/>
                 <w:shd w:fill="auto" w:val="clear"/>
                 <w:lang w:val="ru-RU"/>
               </w:rPr>
@@ -2710,8 +2726,8 @@
                 <w:rFonts w:ascii="Times New Roman" w:hAnsi="Times New Roman"/>
                 <w:b/>
                 <w:bCs/>
-                <w:sz w:val="18"/>
-                <w:szCs w:val="18"/>
+                <w:sz w:val="22"/>
+                <w:szCs w:val="22"/>
                 <w:shd w:fill="auto" w:val="clear"/>
                 <w:lang w:val="ru-RU"/>
               </w:rPr>
@@ -2735,15 +2751,18 @@
             <w:pPr>
               <w:pStyle w:val="Normal"/>
               <w:spacing w:lineRule="auto" w:line="240" w:before="0" w:after="0"/>
-              <w:rPr/>
+              <w:rPr>
+                <w:sz w:val="22"/>
+                <w:szCs w:val="22"/>
+              </w:rPr>
             </w:pPr>
             <w:r>
               <w:rPr>
                 <w:rFonts w:ascii="Times New Roman" w:hAnsi="Times New Roman"/>
                 <w:b/>
                 <w:bCs/>
-                <w:sz w:val="18"/>
-                <w:szCs w:val="18"/>
+                <w:sz w:val="22"/>
+                <w:szCs w:val="22"/>
                 <w:shd w:fill="auto" w:val="clear"/>
                 <w:lang w:val="ru-RU"/>
               </w:rPr>
@@ -2754,8 +2773,8 @@
                 <w:rFonts w:ascii="Times New Roman" w:hAnsi="Times New Roman"/>
                 <w:b/>
                 <w:bCs/>
-                <w:sz w:val="18"/>
-                <w:szCs w:val="18"/>
+                <w:sz w:val="22"/>
+                <w:szCs w:val="22"/>
                 <w:shd w:fill="auto" w:val="clear"/>
                 <w:lang w:val="ru-RU"/>
               </w:rPr>

</xml_diff>